<commit_message>
tareas SI y java Programacion
</commit_message>
<xml_diff>
--- a/sistema_informatico/ciclo-superior-daw-sistemas-informaticos-tarea-unidad-1.docx
+++ b/sistema_informatico/ciclo-superior-daw-sistemas-informaticos-tarea-unidad-1.docx
@@ -82,7 +82,7 @@
           <w:sz w:val="20"/>
         </w:rPr>
         <w:drawing>
-          <wp:inline distT="0" distB="0" distL="0" distR="0">
+          <wp:inline distT="0" distB="0" distL="0" distR="0" wp14:anchorId="2334BF8C" wp14:editId="39A52B7C">
             <wp:extent cx="5829232" cy="406050"/>
             <wp:effectExtent l="0" t="0" r="0" b="0"/>
             <wp:docPr id="1" name="image1.png"/>
@@ -150,7 +150,7 @@
           <w:noProof/>
         </w:rPr>
         <w:drawing>
-          <wp:anchor distT="0" distB="0" distL="0" distR="0" simplePos="0" relativeHeight="251658240" behindDoc="0" locked="0" layoutInCell="1" allowOverlap="1">
+          <wp:anchor distT="0" distB="0" distL="0" distR="0" simplePos="0" relativeHeight="251658240" behindDoc="0" locked="0" layoutInCell="1" allowOverlap="1" wp14:anchorId="108214C8" wp14:editId="6964033D">
             <wp:simplePos x="0" y="0"/>
             <wp:positionH relativeFrom="page">
               <wp:posOffset>2986535</wp:posOffset>
@@ -217,7 +217,7 @@
           <w:noProof/>
         </w:rPr>
         <w:drawing>
-          <wp:anchor distT="0" distB="0" distL="0" distR="0" simplePos="0" relativeHeight="251659264" behindDoc="0" locked="0" layoutInCell="1" allowOverlap="1">
+          <wp:anchor distT="0" distB="0" distL="0" distR="0" simplePos="0" relativeHeight="251659264" behindDoc="0" locked="0" layoutInCell="1" allowOverlap="1" wp14:anchorId="3CDD190C" wp14:editId="0916ABB1">
             <wp:simplePos x="0" y="0"/>
             <wp:positionH relativeFrom="page">
               <wp:posOffset>4243838</wp:posOffset>
@@ -284,7 +284,7 @@
           <w:noProof/>
         </w:rPr>
         <w:drawing>
-          <wp:anchor distT="0" distB="0" distL="0" distR="0" simplePos="0" relativeHeight="2" behindDoc="0" locked="0" layoutInCell="1" allowOverlap="1">
+          <wp:anchor distT="0" distB="0" distL="0" distR="0" simplePos="0" relativeHeight="2" behindDoc="0" locked="0" layoutInCell="1" allowOverlap="1" wp14:anchorId="45C55FF8" wp14:editId="3FFF8F8D">
             <wp:simplePos x="0" y="0"/>
             <wp:positionH relativeFrom="page">
               <wp:posOffset>3535176</wp:posOffset>
@@ -552,7 +552,7 @@
                 <w:sz w:val="20"/>
               </w:rPr>
               <w:drawing>
-                <wp:inline distT="0" distB="0" distL="0" distR="0">
+                <wp:inline distT="0" distB="0" distL="0" distR="0" wp14:anchorId="4A32E1A0" wp14:editId="1D0682F4">
                   <wp:extent cx="1738333" cy="1036034"/>
                   <wp:effectExtent l="0" t="0" r="0" b="0"/>
                   <wp:docPr id="9" name="image5.jpeg"/>
@@ -645,7 +645,7 @@
                 <w:sz w:val="20"/>
               </w:rPr>
               <w:drawing>
-                <wp:inline distT="0" distB="0" distL="0" distR="0">
+                <wp:inline distT="0" distB="0" distL="0" distR="0" wp14:anchorId="1DDA9D97" wp14:editId="66DC6040">
                   <wp:extent cx="2143396" cy="1032700"/>
                   <wp:effectExtent l="0" t="0" r="0" b="0"/>
                   <wp:docPr id="11" name="image6.jpeg"/>
@@ -737,7 +737,7 @@
                 <w:sz w:val="20"/>
               </w:rPr>
               <w:drawing>
-                <wp:inline distT="0" distB="0" distL="0" distR="0">
+                <wp:inline distT="0" distB="0" distL="0" distR="0" wp14:anchorId="2F657282" wp14:editId="61E6B759">
                   <wp:extent cx="1500051" cy="932688"/>
                   <wp:effectExtent l="0" t="0" r="0" b="0"/>
                   <wp:docPr id="13" name="image7.jpeg"/>
@@ -921,7 +921,7 @@
                 <w:sz w:val="20"/>
               </w:rPr>
               <w:drawing>
-                <wp:inline distT="0" distB="0" distL="0" distR="0">
+                <wp:inline distT="0" distB="0" distL="0" distR="0" wp14:anchorId="6B14AE2A" wp14:editId="136A837C">
                   <wp:extent cx="2238208" cy="374903"/>
                   <wp:effectExtent l="0" t="0" r="0" b="0"/>
                   <wp:docPr id="15" name="image8.jpeg"/>
@@ -1012,7 +1012,7 @@
                 <w:sz w:val="20"/>
               </w:rPr>
               <w:drawing>
-                <wp:inline distT="0" distB="0" distL="0" distR="0">
+                <wp:inline distT="0" distB="0" distL="0" distR="0" wp14:anchorId="7842FA32" wp14:editId="3C853B50">
                   <wp:extent cx="1628398" cy="838390"/>
                   <wp:effectExtent l="0" t="0" r="0" b="0"/>
                   <wp:docPr id="17" name="image9.png"/>
@@ -1197,7 +1197,7 @@
                 <w:sz w:val="20"/>
               </w:rPr>
               <w:drawing>
-                <wp:inline distT="0" distB="0" distL="0" distR="0">
+                <wp:inline distT="0" distB="0" distL="0" distR="0" wp14:anchorId="5E413C4F" wp14:editId="07B39126">
                   <wp:extent cx="923193" cy="978408"/>
                   <wp:effectExtent l="0" t="0" r="0" b="0"/>
                   <wp:docPr id="19" name="image10.jpeg"/>
@@ -1279,7 +1279,7 @@
                 <w:sz w:val="20"/>
               </w:rPr>
               <w:drawing>
-                <wp:inline distT="0" distB="0" distL="0" distR="0">
+                <wp:inline distT="0" distB="0" distL="0" distR="0" wp14:anchorId="0ED4083E" wp14:editId="774CF728">
                   <wp:extent cx="768419" cy="740663"/>
                   <wp:effectExtent l="0" t="0" r="0" b="0"/>
                   <wp:docPr id="21" name="image11.jpeg"/>
@@ -1481,7 +1481,7 @@
                 <w:sz w:val="20"/>
               </w:rPr>
               <w:drawing>
-                <wp:inline distT="0" distB="0" distL="0" distR="0">
+                <wp:inline distT="0" distB="0" distL="0" distR="0" wp14:anchorId="5EB2A20E" wp14:editId="05FFDBEA">
                   <wp:extent cx="1679497" cy="548640"/>
                   <wp:effectExtent l="0" t="0" r="0" b="0"/>
                   <wp:docPr id="23" name="image12.jpeg"/>
@@ -1563,7 +1563,7 @@
                 <w:sz w:val="20"/>
               </w:rPr>
               <w:drawing>
-                <wp:inline distT="0" distB="0" distL="0" distR="0">
+                <wp:inline distT="0" distB="0" distL="0" distR="0" wp14:anchorId="43A457E8" wp14:editId="12CD2617">
                   <wp:extent cx="1648632" cy="836676"/>
                   <wp:effectExtent l="0" t="0" r="0" b="0"/>
                   <wp:docPr id="25" name="image13.jpeg"/>
@@ -1665,8 +1665,6 @@
               </w:rPr>
               <w:t xml:space="preserve"> primero buscamos el conector de 20 pines y lo colocamos donde su muesca y lo mismo con el de 4 pines</w:t>
             </w:r>
-            <w:bookmarkStart w:id="0" w:name="_GoBack"/>
-            <w:bookmarkEnd w:id="0"/>
           </w:p>
         </w:tc>
       </w:tr>
@@ -1811,7 +1809,7 @@
                 <w:sz w:val="20"/>
               </w:rPr>
               <w:drawing>
-                <wp:inline distT="0" distB="0" distL="0" distR="0">
+                <wp:inline distT="0" distB="0" distL="0" distR="0" wp14:anchorId="633B0CC8" wp14:editId="6B6638FC">
                   <wp:extent cx="904875" cy="952500"/>
                   <wp:effectExtent l="0" t="0" r="0" b="0"/>
                   <wp:docPr id="27" name="image14.jpeg"/>
@@ -1856,6 +1854,13 @@
                 <w:sz w:val="21"/>
               </w:rPr>
             </w:pPr>
+            <w:r>
+              <w:rPr>
+                <w:b/>
+                <w:sz w:val="21"/>
+              </w:rPr>
+              <w:t xml:space="preserve">Zócalo CPU </w:t>
+            </w:r>
           </w:p>
           <w:p>
             <w:pPr>
@@ -1897,7 +1902,7 @@
                 <w:sz w:val="20"/>
               </w:rPr>
               <w:drawing>
-                <wp:inline distT="0" distB="0" distL="0" distR="0">
+                <wp:inline distT="0" distB="0" distL="0" distR="0" wp14:anchorId="4BA4FDB4" wp14:editId="13A5BA6F">
                   <wp:extent cx="1380206" cy="958405"/>
                   <wp:effectExtent l="0" t="0" r="0" b="0"/>
                   <wp:docPr id="29" name="image15.png"/>
@@ -1943,6 +1948,22 @@
               </w:rPr>
             </w:pPr>
           </w:p>
+          <w:p>
+            <w:pPr>
+              <w:pStyle w:val="TableParagraph"/>
+              <w:ind w:left="165" w:right="162"/>
+              <w:jc w:val="center"/>
+              <w:rPr>
+                <w:b/>
+              </w:rPr>
+            </w:pPr>
+            <w:r>
+              <w:rPr>
+                <w:b/>
+              </w:rPr>
+              <w:t>CPU PGA</w:t>
+            </w:r>
+          </w:p>
         </w:tc>
         <w:tc>
           <w:tcPr>
@@ -1989,6 +2010,12 @@
                 <w:b/>
               </w:rPr>
             </w:pPr>
+            <w:r>
+              <w:rPr>
+                <w:b/>
+              </w:rPr>
+              <w:t>Para colocar la CPU, primero se debe de levantar la manija metálica del zócalo y colocarlo de tal modo que marca la muesca del zócalo, una vez colocado apretar la manija metálica</w:t>
+            </w:r>
           </w:p>
         </w:tc>
       </w:tr>
@@ -2106,7 +2133,7 @@
                 <w:sz w:val="20"/>
               </w:rPr>
               <w:drawing>
-                <wp:inline distT="0" distB="0" distL="0" distR="0">
+                <wp:inline distT="0" distB="0" distL="0" distR="0" wp14:anchorId="57EDF835" wp14:editId="5F57F8D2">
                   <wp:extent cx="2149576" cy="295275"/>
                   <wp:effectExtent l="0" t="0" r="0" b="0"/>
                   <wp:docPr id="31" name="image16.jpeg"/>
@@ -2161,6 +2188,12 @@
                 <w:b/>
               </w:rPr>
             </w:pPr>
+            <w:r>
+              <w:rPr>
+                <w:b/>
+              </w:rPr>
+              <w:t>PCI Express x16</w:t>
+            </w:r>
           </w:p>
         </w:tc>
         <w:tc>
@@ -2189,7 +2222,7 @@
                 <w:sz w:val="20"/>
               </w:rPr>
               <w:drawing>
-                <wp:inline distT="0" distB="0" distL="0" distR="0">
+                <wp:inline distT="0" distB="0" distL="0" distR="0" wp14:anchorId="4CF17BE3" wp14:editId="672A8702">
                   <wp:extent cx="1611637" cy="1092327"/>
                   <wp:effectExtent l="0" t="0" r="0" b="0"/>
                   <wp:docPr id="33" name="image17.png"/>
@@ -2235,6 +2268,12 @@
                 <w:b/>
               </w:rPr>
             </w:pPr>
+            <w:r>
+              <w:rPr>
+                <w:b/>
+              </w:rPr>
+              <w:t>Tarjeta Gráfica</w:t>
+            </w:r>
           </w:p>
         </w:tc>
         <w:tc>
@@ -2272,6 +2311,63 @@
                 <w:b/>
               </w:rPr>
             </w:pPr>
+            <w:r>
+              <w:rPr>
+                <w:b/>
+              </w:rPr>
+              <w:t xml:space="preserve">Para colocar la gráfica solo necesitamos saber </w:t>
+            </w:r>
+            <w:proofErr w:type="spellStart"/>
+            <w:r>
+              <w:rPr>
+                <w:b/>
+              </w:rPr>
+              <w:t>donde</w:t>
+            </w:r>
+            <w:proofErr w:type="spellEnd"/>
+            <w:r>
+              <w:rPr>
+                <w:b/>
+              </w:rPr>
+              <w:t xml:space="preserve"> se encuentran los nodos de salida de vídeo (VGA, </w:t>
+            </w:r>
+            <w:proofErr w:type="spellStart"/>
+            <w:r>
+              <w:rPr>
+                <w:b/>
+              </w:rPr>
+              <w:t>hdmi</w:t>
+            </w:r>
+            <w:proofErr w:type="spellEnd"/>
+            <w:r>
+              <w:rPr>
+                <w:b/>
+              </w:rPr>
+              <w:t>, DisplayPort)</w:t>
+            </w:r>
+          </w:p>
+          <w:p>
+            <w:pPr>
+              <w:pStyle w:val="TableParagraph"/>
+              <w:spacing w:before="2"/>
+              <w:ind w:left="114" w:right="107"/>
+              <w:jc w:val="center"/>
+              <w:rPr>
+                <w:b/>
+              </w:rPr>
+            </w:pPr>
+            <w:r>
+              <w:rPr>
+                <w:b/>
+              </w:rPr>
+              <w:t>Y colocarlo mirando hacia donde se encuentran los otros conectores de vídeo de la placa externos</w:t>
+            </w:r>
+            <w:r>
+              <w:rPr>
+                <w:b/>
+              </w:rPr>
+              <w:t xml:space="preserve"> y la aseguramos con tornillo al chasis del ordenador</w:t>
+            </w:r>
           </w:p>
         </w:tc>
       </w:tr>
@@ -2380,7 +2476,7 @@
                 <w:sz w:val="20"/>
               </w:rPr>
               <w:drawing>
-                <wp:inline distT="0" distB="0" distL="0" distR="0">
+                <wp:inline distT="0" distB="0" distL="0" distR="0" wp14:anchorId="658A45DF" wp14:editId="04A7564E">
                   <wp:extent cx="1200150" cy="1104138"/>
                   <wp:effectExtent l="0" t="0" r="0" b="0"/>
                   <wp:docPr id="35" name="image18.jpeg"/>
@@ -2434,6 +2530,12 @@
                 <w:b/>
               </w:rPr>
             </w:pPr>
+            <w:r>
+              <w:rPr>
+                <w:b/>
+              </w:rPr>
+              <w:t>Conector pin de ventilador de CPU</w:t>
+            </w:r>
           </w:p>
         </w:tc>
         <w:tc>
@@ -2454,7 +2556,7 @@
                 <w:sz w:val="20"/>
               </w:rPr>
               <w:drawing>
-                <wp:inline distT="0" distB="0" distL="0" distR="0">
+                <wp:inline distT="0" distB="0" distL="0" distR="0" wp14:anchorId="22A69D18" wp14:editId="6CE56261">
                   <wp:extent cx="1468573" cy="1499615"/>
                   <wp:effectExtent l="0" t="0" r="0" b="0"/>
                   <wp:docPr id="37" name="image19.jpeg"/>
@@ -2500,6 +2602,12 @@
                 <w:b/>
               </w:rPr>
             </w:pPr>
+            <w:r>
+              <w:rPr>
+                <w:b/>
+              </w:rPr>
+              <w:t>Disipador</w:t>
+            </w:r>
           </w:p>
         </w:tc>
         <w:tc>
@@ -2562,6 +2670,12 @@
                 <w:b/>
               </w:rPr>
             </w:pPr>
+            <w:r>
+              <w:rPr>
+                <w:b/>
+              </w:rPr>
+              <w:t>Para colocar el disipador, primero colocamos la CPU y pasta térmica sobre esta, luego colocamos el disipador y lo aseguramos correctamente, por último, le conectamos el cable en la ranura mencionada</w:t>
+            </w:r>
           </w:p>
         </w:tc>
       </w:tr>
@@ -2702,7 +2816,7 @@
                 <w:sz w:val="20"/>
               </w:rPr>
               <w:drawing>
-                <wp:inline distT="0" distB="0" distL="0" distR="0">
+                <wp:inline distT="0" distB="0" distL="0" distR="0" wp14:anchorId="36FC1A13" wp14:editId="0081280B">
                   <wp:extent cx="1885965" cy="765810"/>
                   <wp:effectExtent l="0" t="0" r="0" b="0"/>
                   <wp:docPr id="39" name="image20.jpeg"/>
@@ -2756,6 +2870,12 @@
                 <w:b/>
               </w:rPr>
             </w:pPr>
+            <w:r>
+              <w:rPr>
+                <w:b/>
+              </w:rPr>
+              <w:t xml:space="preserve">PCI </w:t>
+            </w:r>
           </w:p>
         </w:tc>
         <w:tc>
@@ -2786,7 +2906,7 @@
                 <w:sz w:val="20"/>
               </w:rPr>
               <w:drawing>
-                <wp:inline distT="0" distB="0" distL="0" distR="0">
+                <wp:inline distT="0" distB="0" distL="0" distR="0" wp14:anchorId="75E9D901" wp14:editId="2736DF3F">
                   <wp:extent cx="1359876" cy="827531"/>
                   <wp:effectExtent l="0" t="0" r="0" b="0"/>
                   <wp:docPr id="41" name="image21.jpeg"/>
@@ -2840,6 +2960,12 @@
                 <w:b/>
               </w:rPr>
             </w:pPr>
+            <w:r>
+              <w:rPr>
+                <w:b/>
+              </w:rPr>
+              <w:t>Tarjeta Wifi/Ethernet</w:t>
+            </w:r>
           </w:p>
         </w:tc>
         <w:tc>
@@ -2886,6 +3012,26 @@
                 <w:b/>
               </w:rPr>
             </w:pPr>
+            <w:r>
+              <w:rPr>
+                <w:b/>
+              </w:rPr>
+              <w:t xml:space="preserve">Para colocar la tarjeta de red, nos </w:t>
+            </w:r>
+            <w:proofErr w:type="spellStart"/>
+            <w:r>
+              <w:rPr>
+                <w:b/>
+              </w:rPr>
+              <w:t>cercionamos</w:t>
+            </w:r>
+            <w:proofErr w:type="spellEnd"/>
+            <w:r>
+              <w:rPr>
+                <w:b/>
+              </w:rPr>
+              <w:t xml:space="preserve"> de la muesca que tiene y la colocamos conforme marque el zócalo PCI, para luego asegurarla al chasis del ordenador con tornillo</w:t>
+            </w:r>
           </w:p>
         </w:tc>
       </w:tr>
@@ -2983,7 +3129,7 @@
                 <w:sz w:val="20"/>
               </w:rPr>
               <w:drawing>
-                <wp:inline distT="0" distB="0" distL="0" distR="0">
+                <wp:inline distT="0" distB="0" distL="0" distR="0" wp14:anchorId="7F1F37D8" wp14:editId="6BAE5001">
                   <wp:extent cx="1680220" cy="1152144"/>
                   <wp:effectExtent l="0" t="0" r="0" b="0"/>
                   <wp:docPr id="43" name="image22.jpeg"/>
@@ -3038,6 +3184,12 @@
                 <w:b/>
               </w:rPr>
             </w:pPr>
+            <w:r>
+              <w:rPr>
+                <w:b/>
+              </w:rPr>
+              <w:t>Conector panel frontal</w:t>
+            </w:r>
           </w:p>
         </w:tc>
         <w:tc>
@@ -3068,7 +3220,7 @@
                 <w:sz w:val="20"/>
               </w:rPr>
               <w:drawing>
-                <wp:inline distT="0" distB="0" distL="0" distR="0">
+                <wp:inline distT="0" distB="0" distL="0" distR="0" wp14:anchorId="19401DFE" wp14:editId="4BCB54D7">
                   <wp:extent cx="1679009" cy="1229868"/>
                   <wp:effectExtent l="0" t="0" r="0" b="0"/>
                   <wp:docPr id="45" name="image23.jpeg"/>
@@ -3123,6 +3275,12 @@
                 <w:b/>
               </w:rPr>
             </w:pPr>
+            <w:r>
+              <w:rPr>
+                <w:b/>
+              </w:rPr>
+              <w:t>Panel Frontal</w:t>
+            </w:r>
           </w:p>
         </w:tc>
         <w:tc>
@@ -3162,7 +3320,7 @@
                 <w:sz w:val="20"/>
               </w:rPr>
               <w:drawing>
-                <wp:inline distT="0" distB="0" distL="0" distR="0">
+                <wp:inline distT="0" distB="0" distL="0" distR="0" wp14:anchorId="5282A574" wp14:editId="79123BD0">
                   <wp:extent cx="1445883" cy="845819"/>
                   <wp:effectExtent l="0" t="0" r="0" b="0"/>
                   <wp:docPr id="47" name="image24.jpeg"/>
@@ -3215,6 +3373,12 @@
                 <w:b/>
               </w:rPr>
             </w:pPr>
+            <w:r>
+              <w:rPr>
+                <w:b/>
+              </w:rPr>
+              <w:t>Pines panel frontal</w:t>
+            </w:r>
           </w:p>
         </w:tc>
         <w:tc>
@@ -3256,6 +3420,26 @@
                 <w:b/>
               </w:rPr>
             </w:pPr>
+            <w:r>
+              <w:rPr>
+                <w:b/>
+              </w:rPr>
+              <w:t xml:space="preserve">Esto nos permite usar dispositivos </w:t>
+            </w:r>
+            <w:proofErr w:type="spellStart"/>
+            <w:r>
+              <w:rPr>
+                <w:b/>
+              </w:rPr>
+              <w:t>usb</w:t>
+            </w:r>
+            <w:proofErr w:type="spellEnd"/>
+            <w:r>
+              <w:rPr>
+                <w:b/>
+              </w:rPr>
+              <w:t>, tener audio y encender el ordenador sin tener que abrirlo o dirigirnos a su parte trasera, usado con un destornillador típicamente para comprobar que este arranca</w:t>
+            </w:r>
           </w:p>
         </w:tc>
       </w:tr>
@@ -3345,7 +3529,7 @@
                 <w:sz w:val="20"/>
               </w:rPr>
               <w:drawing>
-                <wp:inline distT="0" distB="0" distL="0" distR="0">
+                <wp:inline distT="0" distB="0" distL="0" distR="0" wp14:anchorId="4B8D9140" wp14:editId="110A134D">
                   <wp:extent cx="1790721" cy="1060989"/>
                   <wp:effectExtent l="0" t="0" r="0" b="0"/>
                   <wp:docPr id="49" name="image25.jpeg"/>
@@ -3400,6 +3584,12 @@
                 <w:b/>
               </w:rPr>
             </w:pPr>
+            <w:r>
+              <w:rPr>
+                <w:b/>
+              </w:rPr>
+              <w:t>Conector SATA</w:t>
+            </w:r>
           </w:p>
         </w:tc>
         <w:tc>
@@ -3430,7 +3620,7 @@
                 <w:sz w:val="20"/>
               </w:rPr>
               <w:drawing>
-                <wp:inline distT="0" distB="0" distL="0" distR="0">
+                <wp:inline distT="0" distB="0" distL="0" distR="0" wp14:anchorId="4A933CA6" wp14:editId="0D8A97AE">
                   <wp:extent cx="2092103" cy="1027938"/>
                   <wp:effectExtent l="0" t="0" r="0" b="0"/>
                   <wp:docPr id="51" name="image26.jpeg"/>
@@ -3485,6 +3675,12 @@
                 <w:b/>
               </w:rPr>
             </w:pPr>
+            <w:r>
+              <w:rPr>
+                <w:b/>
+              </w:rPr>
+              <w:t>Disco duro SATA</w:t>
+            </w:r>
           </w:p>
         </w:tc>
         <w:tc>
@@ -3524,7 +3720,7 @@
                 <w:sz w:val="20"/>
               </w:rPr>
               <w:drawing>
-                <wp:inline distT="0" distB="0" distL="0" distR="0">
+                <wp:inline distT="0" distB="0" distL="0" distR="0" wp14:anchorId="18E9ACDB" wp14:editId="5798FB57">
                   <wp:extent cx="1545756" cy="845819"/>
                   <wp:effectExtent l="0" t="0" r="0" b="0"/>
                   <wp:docPr id="53" name="image27.jpeg"/>
@@ -3578,6 +3774,12 @@
                 <w:b/>
               </w:rPr>
             </w:pPr>
+            <w:r>
+              <w:rPr>
+                <w:b/>
+              </w:rPr>
+              <w:t>Cable SATA</w:t>
+            </w:r>
           </w:p>
         </w:tc>
         <w:tc>
@@ -3610,6 +3812,12 @@
                 <w:b/>
               </w:rPr>
             </w:pPr>
+            <w:r>
+              <w:rPr>
+                <w:b/>
+              </w:rPr>
+              <w:t>Conector mayoritariamente usado en los ordenadores actuales para conectar múltiples discos duros tanto SSD como HDD</w:t>
+            </w:r>
           </w:p>
         </w:tc>
       </w:tr>
@@ -3757,7 +3965,7 @@
                 <w:sz w:val="20"/>
               </w:rPr>
               <w:drawing>
-                <wp:inline distT="0" distB="0" distL="0" distR="0">
+                <wp:inline distT="0" distB="0" distL="0" distR="0" wp14:anchorId="22EF11C6" wp14:editId="48899240">
                   <wp:extent cx="1595673" cy="1197864"/>
                   <wp:effectExtent l="0" t="0" r="0" b="0"/>
                   <wp:docPr id="55" name="image28.jpeg"/>
@@ -3811,6 +4019,12 @@
                 <w:b/>
               </w:rPr>
             </w:pPr>
+            <w:r>
+              <w:rPr>
+                <w:b/>
+              </w:rPr>
+              <w:t>Puertos frontales I/O</w:t>
+            </w:r>
           </w:p>
         </w:tc>
         <w:tc>
@@ -3850,7 +4064,7 @@
                 <w:sz w:val="20"/>
               </w:rPr>
               <w:drawing>
-                <wp:inline distT="0" distB="0" distL="0" distR="0">
+                <wp:inline distT="0" distB="0" distL="0" distR="0" wp14:anchorId="60BC795D" wp14:editId="3988D601">
                   <wp:extent cx="1440213" cy="891539"/>
                   <wp:effectExtent l="0" t="0" r="0" b="0"/>
                   <wp:docPr id="57" name="image29.jpeg"/>
@@ -3905,6 +4119,12 @@
                 <w:b/>
               </w:rPr>
             </w:pPr>
+            <w:r>
+              <w:rPr>
+                <w:b/>
+              </w:rPr>
+              <w:t>Disquetera</w:t>
+            </w:r>
           </w:p>
         </w:tc>
         <w:tc>
@@ -3958,6 +4178,12 @@
                 <w:b/>
               </w:rPr>
             </w:pPr>
+            <w:r>
+              <w:rPr>
+                <w:b/>
+              </w:rPr>
+              <w:t>Usado para leer desde Disquetes hasta tarjetas SD, no es muy usado por la poca versatilidad que tienen, ya que no se usa tanto en ordenadores</w:t>
+            </w:r>
           </w:p>
         </w:tc>
       </w:tr>
@@ -4056,7 +4282,7 @@
                 <w:sz w:val="20"/>
               </w:rPr>
               <w:drawing>
-                <wp:inline distT="0" distB="0" distL="0" distR="0">
+                <wp:inline distT="0" distB="0" distL="0" distR="0" wp14:anchorId="5186A972" wp14:editId="361F6663">
                   <wp:extent cx="1500197" cy="1122140"/>
                   <wp:effectExtent l="0" t="0" r="0" b="0"/>
                   <wp:docPr id="59" name="image30.jpeg"/>
@@ -4110,6 +4336,12 @@
                 <w:b/>
               </w:rPr>
             </w:pPr>
+            <w:r>
+              <w:rPr>
+                <w:b/>
+              </w:rPr>
+              <w:t>Conector de 4 pines de fuente</w:t>
+            </w:r>
           </w:p>
         </w:tc>
         <w:tc>
@@ -4149,7 +4381,7 @@
                 <w:sz w:val="20"/>
               </w:rPr>
               <w:drawing>
-                <wp:inline distT="0" distB="0" distL="0" distR="0">
+                <wp:inline distT="0" distB="0" distL="0" distR="0" wp14:anchorId="6DA7B3FC" wp14:editId="55B0CA73">
                   <wp:extent cx="1813307" cy="908494"/>
                   <wp:effectExtent l="0" t="0" r="0" b="0"/>
                   <wp:docPr id="61" name="image31.jpeg"/>
@@ -4195,6 +4427,12 @@
                 <w:b/>
               </w:rPr>
             </w:pPr>
+            <w:r>
+              <w:rPr>
+                <w:b/>
+              </w:rPr>
+              <w:t>Fuente de alimentación</w:t>
+            </w:r>
           </w:p>
         </w:tc>
         <w:tc>
@@ -4257,6 +4495,12 @@
                 <w:b/>
               </w:rPr>
             </w:pPr>
+            <w:r>
+              <w:rPr>
+                <w:b/>
+              </w:rPr>
+              <w:t>Como mencione anterior mente este se debe colocar conforme la muesca</w:t>
+            </w:r>
           </w:p>
         </w:tc>
       </w:tr>
@@ -4347,7 +4591,7 @@
                 <w:sz w:val="20"/>
               </w:rPr>
               <w:drawing>
-                <wp:inline distT="0" distB="0" distL="0" distR="0">
+                <wp:inline distT="0" distB="0" distL="0" distR="0" wp14:anchorId="7A537A03" wp14:editId="6F7CB5EE">
                   <wp:extent cx="1769325" cy="1145286"/>
                   <wp:effectExtent l="0" t="0" r="0" b="0"/>
                   <wp:docPr id="63" name="image32.jpeg"/>
@@ -4403,6 +4647,12 @@
                 <w:b/>
               </w:rPr>
             </w:pPr>
+            <w:r>
+              <w:rPr>
+                <w:b/>
+              </w:rPr>
+              <w:t>Conector de ventilador</w:t>
+            </w:r>
           </w:p>
         </w:tc>
         <w:tc>
@@ -4442,7 +4692,7 @@
                 <w:sz w:val="20"/>
               </w:rPr>
               <w:drawing>
-                <wp:inline distT="0" distB="0" distL="0" distR="0">
+                <wp:inline distT="0" distB="0" distL="0" distR="0" wp14:anchorId="1E5C5A95" wp14:editId="580BC7FD">
                   <wp:extent cx="1293876" cy="1065276"/>
                   <wp:effectExtent l="0" t="0" r="0" b="0"/>
                   <wp:docPr id="65" name="image33.jpeg"/>
@@ -4488,6 +4738,12 @@
                 <w:b/>
               </w:rPr>
             </w:pPr>
+            <w:r>
+              <w:rPr>
+                <w:b/>
+              </w:rPr>
+              <w:t>Ventilador</w:t>
+            </w:r>
           </w:p>
         </w:tc>
         <w:tc>
@@ -4541,6 +4797,18 @@
                 <w:b/>
               </w:rPr>
             </w:pPr>
+            <w:r>
+              <w:rPr>
+                <w:b/>
+              </w:rPr>
+              <w:t>Para brindar mayor air Flow dentro de</w:t>
+            </w:r>
+            <w:r>
+              <w:rPr>
+                <w:b/>
+              </w:rPr>
+              <w:t>l ordenador y permitir una bajada en la temperatura del interior del ordenador</w:t>
+            </w:r>
           </w:p>
         </w:tc>
       </w:tr>
@@ -4681,7 +4949,7 @@
                 <w:sz w:val="20"/>
               </w:rPr>
               <w:drawing>
-                <wp:inline distT="0" distB="0" distL="0" distR="0">
+                <wp:inline distT="0" distB="0" distL="0" distR="0" wp14:anchorId="57042826" wp14:editId="55852194">
                   <wp:extent cx="1733542" cy="881634"/>
                   <wp:effectExtent l="0" t="0" r="0" b="0"/>
                   <wp:docPr id="67" name="image34.jpeg"/>
@@ -4726,6 +4994,13 @@
                 <w:sz w:val="21"/>
               </w:rPr>
             </w:pPr>
+            <w:r>
+              <w:rPr>
+                <w:b/>
+                <w:sz w:val="21"/>
+              </w:rPr>
+              <w:t>Conector de CD y Auxiliar</w:t>
+            </w:r>
           </w:p>
           <w:p>
             <w:pPr>
@@ -4766,7 +5041,7 @@
                 <w:sz w:val="20"/>
               </w:rPr>
               <w:drawing>
-                <wp:inline distT="0" distB="0" distL="0" distR="0">
+                <wp:inline distT="0" distB="0" distL="0" distR="0" wp14:anchorId="6F661A8E" wp14:editId="3B15BA17">
                   <wp:extent cx="1071562" cy="1071562"/>
                   <wp:effectExtent l="0" t="0" r="0" b="0"/>
                   <wp:docPr id="69" name="image35.jpeg"/>
@@ -4812,6 +5087,12 @@
                 <w:b/>
               </w:rPr>
             </w:pPr>
+            <w:r>
+              <w:rPr>
+                <w:b/>
+              </w:rPr>
+              <w:t>Lector de CD</w:t>
+            </w:r>
           </w:p>
         </w:tc>
         <w:tc>
@@ -4866,6 +5147,12 @@
                 <w:b/>
               </w:rPr>
             </w:pPr>
+            <w:r>
+              <w:rPr>
+                <w:b/>
+              </w:rPr>
+              <w:t>Lector de CD, el cual se le insertan discos y puede tanto leerlos como escribir en ellos</w:t>
+            </w:r>
           </w:p>
         </w:tc>
       </w:tr>
@@ -4956,7 +5243,7 @@
                 <w:sz w:val="20"/>
               </w:rPr>
               <w:drawing>
-                <wp:inline distT="0" distB="0" distL="0" distR="0">
+                <wp:inline distT="0" distB="0" distL="0" distR="0" wp14:anchorId="4B90CB9D" wp14:editId="0CE015EA">
                   <wp:extent cx="1573878" cy="725233"/>
                   <wp:effectExtent l="0" t="0" r="0" b="0"/>
                   <wp:docPr id="71" name="image36.jpeg"/>
@@ -5010,6 +5297,20 @@
                 <w:b/>
               </w:rPr>
             </w:pPr>
+            <w:proofErr w:type="spellStart"/>
+            <w:r>
+              <w:rPr>
+                <w:b/>
+              </w:rPr>
+              <w:t>Analog</w:t>
+            </w:r>
+            <w:proofErr w:type="spellEnd"/>
+            <w:r>
+              <w:rPr>
+                <w:b/>
+              </w:rPr>
+              <w:t xml:space="preserve"> Audio Front Panel</w:t>
+            </w:r>
           </w:p>
         </w:tc>
         <w:tc>
@@ -5049,7 +5350,7 @@
                 <w:sz w:val="20"/>
               </w:rPr>
               <w:drawing>
-                <wp:inline distT="0" distB="0" distL="0" distR="0">
+                <wp:inline distT="0" distB="0" distL="0" distR="0" wp14:anchorId="0BB55740" wp14:editId="46E0F04A">
                   <wp:extent cx="1927889" cy="900684"/>
                   <wp:effectExtent l="0" t="0" r="0" b="0"/>
                   <wp:docPr id="73" name="image37.jpeg"/>
@@ -5102,6 +5403,12 @@
                 <w:b/>
               </w:rPr>
             </w:pPr>
+            <w:r>
+              <w:rPr>
+                <w:b/>
+              </w:rPr>
+              <w:t>Panel frontal</w:t>
+            </w:r>
           </w:p>
         </w:tc>
         <w:tc>
@@ -5147,6 +5454,12 @@
                 <w:b/>
               </w:rPr>
             </w:pPr>
+            <w:r>
+              <w:rPr>
+                <w:b/>
+              </w:rPr>
+              <w:t>Al colocarlo correctamente, se encarga de enviar el audio a esos dos pines en la izquierda para que puedas usar el audio con cascos y micrófono</w:t>
+            </w:r>
           </w:p>
         </w:tc>
       </w:tr>
@@ -5245,7 +5558,7 @@
                 <w:sz w:val="20"/>
               </w:rPr>
               <w:drawing>
-                <wp:inline distT="0" distB="0" distL="0" distR="0">
+                <wp:inline distT="0" distB="0" distL="0" distR="0" wp14:anchorId="3E6F3002" wp14:editId="4A91907F">
                   <wp:extent cx="950284" cy="817244"/>
                   <wp:effectExtent l="0" t="0" r="0" b="0"/>
                   <wp:docPr id="75" name="image38.jpeg"/>
@@ -5299,6 +5612,12 @@
                 <w:b/>
               </w:rPr>
             </w:pPr>
+            <w:r>
+              <w:rPr>
+                <w:b/>
+              </w:rPr>
+              <w:t>Conector COM interno</w:t>
+            </w:r>
           </w:p>
         </w:tc>
         <w:tc>
@@ -5328,7 +5647,7 @@
                 <w:sz w:val="20"/>
               </w:rPr>
               <w:drawing>
-                <wp:inline distT="0" distB="0" distL="0" distR="0">
+                <wp:inline distT="0" distB="0" distL="0" distR="0" wp14:anchorId="4D6134D3" wp14:editId="25345094">
                   <wp:extent cx="1168146" cy="1042987"/>
                   <wp:effectExtent l="0" t="0" r="0" b="0"/>
                   <wp:docPr id="77" name="image39.jpeg"/>
@@ -5382,6 +5701,12 @@
                 <w:b/>
               </w:rPr>
             </w:pPr>
+            <w:r>
+              <w:rPr>
+                <w:b/>
+              </w:rPr>
+              <w:t>Monitor</w:t>
+            </w:r>
           </w:p>
         </w:tc>
         <w:tc>
@@ -5411,7 +5736,7 @@
                 <w:sz w:val="20"/>
               </w:rPr>
               <w:drawing>
-                <wp:inline distT="0" distB="0" distL="0" distR="0">
+                <wp:inline distT="0" distB="0" distL="0" distR="0" wp14:anchorId="63041402" wp14:editId="2E806D31">
                   <wp:extent cx="950976" cy="987551"/>
                   <wp:effectExtent l="0" t="0" r="0" b="0"/>
                   <wp:docPr id="79" name="image40.jpeg"/>
@@ -5464,6 +5789,12 @@
                 <w:b/>
               </w:rPr>
             </w:pPr>
+            <w:r>
+              <w:rPr>
+                <w:b/>
+              </w:rPr>
+              <w:t>Cable VGA</w:t>
+            </w:r>
           </w:p>
         </w:tc>
         <w:tc>
@@ -5491,16 +5822,21 @@
               <w:pStyle w:val="TableParagraph"/>
               <w:spacing w:before="157"/>
               <w:ind w:left="138" w:right="129"/>
-              <w:jc w:val="center"/>
-              <w:rPr>
-                <w:b/>
-              </w:rPr>
-            </w:pPr>
-            <w:r>
-              <w:rPr>
-                <w:b/>
-              </w:rPr>
-              <w:t>.</w:t>
+              <w:rPr>
+                <w:b/>
+              </w:rPr>
+            </w:pPr>
+            <w:r>
+              <w:rPr>
+                <w:b/>
+              </w:rPr>
+              <w:t xml:space="preserve">Con este cable permite que se conecte a monitor VGA y pueda dar video, </w:t>
+            </w:r>
+            <w:r>
+              <w:rPr>
+                <w:b/>
+              </w:rPr>
+              <w:t>para poder conectar el VGA a este conector necesitamos un adaptador USB hembra a VGA hembra y así poder conectarlo</w:t>
             </w:r>
           </w:p>
         </w:tc>
@@ -5642,7 +5978,7 @@
                 <w:sz w:val="20"/>
               </w:rPr>
               <w:drawing>
-                <wp:inline distT="0" distB="0" distL="0" distR="0">
+                <wp:inline distT="0" distB="0" distL="0" distR="0" wp14:anchorId="0FE9A9D3" wp14:editId="1224BFE6">
                   <wp:extent cx="1477953" cy="936116"/>
                   <wp:effectExtent l="0" t="0" r="0" b="0"/>
                   <wp:docPr id="81" name="image41.jpeg"/>
@@ -5697,6 +6033,12 @@
                 <w:b/>
               </w:rPr>
             </w:pPr>
+            <w:r>
+              <w:rPr>
+                <w:b/>
+              </w:rPr>
+              <w:t>Zócalo FireWire</w:t>
+            </w:r>
           </w:p>
         </w:tc>
         <w:tc>
@@ -5727,7 +6069,7 @@
                 <w:sz w:val="20"/>
               </w:rPr>
               <w:drawing>
-                <wp:inline distT="0" distB="0" distL="0" distR="0">
+                <wp:inline distT="0" distB="0" distL="0" distR="0" wp14:anchorId="26E28F88" wp14:editId="5CA917FD">
                   <wp:extent cx="1242341" cy="1024127"/>
                   <wp:effectExtent l="0" t="0" r="0" b="0"/>
                   <wp:docPr id="83" name="image42.jpeg"/>
@@ -5773,6 +6115,12 @@
                 <w:b/>
               </w:rPr>
             </w:pPr>
+            <w:r>
+              <w:rPr>
+                <w:b/>
+              </w:rPr>
+              <w:t>Cámara de fotos</w:t>
+            </w:r>
           </w:p>
         </w:tc>
         <w:tc>
@@ -5803,7 +6151,7 @@
                 <w:sz w:val="20"/>
               </w:rPr>
               <w:drawing>
-                <wp:inline distT="0" distB="0" distL="0" distR="0">
+                <wp:inline distT="0" distB="0" distL="0" distR="0" wp14:anchorId="5E0A3EF8" wp14:editId="4A1E85D0">
                   <wp:extent cx="1264972" cy="877824"/>
                   <wp:effectExtent l="0" t="0" r="0" b="0"/>
                   <wp:docPr id="85" name="image43.jpeg"/>
@@ -5858,6 +6206,20 @@
                 <w:b/>
               </w:rPr>
             </w:pPr>
+            <w:r>
+              <w:rPr>
+                <w:b/>
+              </w:rPr>
+              <w:t xml:space="preserve">Cable </w:t>
+            </w:r>
+            <w:r>
+              <w:rPr>
+                <w:b/>
+              </w:rPr>
+              <w:t>FireWire</w:t>
+            </w:r>
+            <w:bookmarkStart w:id="0" w:name="_GoBack"/>
+            <w:bookmarkEnd w:id="0"/>
           </w:p>
         </w:tc>
         <w:tc>
@@ -5884,6 +6246,12 @@
                 <w:b/>
               </w:rPr>
             </w:pPr>
+            <w:r>
+              <w:rPr>
+                <w:b/>
+              </w:rPr>
+              <w:t>Permite la conexión de una cámara digital con el ordenador y así la sustracción de fotos de la cámara al ordenador</w:t>
+            </w:r>
           </w:p>
         </w:tc>
       </w:tr>
@@ -5975,7 +6343,7 @@
                 <w:sz w:val="20"/>
               </w:rPr>
               <w:drawing>
-                <wp:inline distT="0" distB="0" distL="0" distR="0">
+                <wp:inline distT="0" distB="0" distL="0" distR="0" wp14:anchorId="10004E9D" wp14:editId="76D48C89">
                   <wp:extent cx="580644" cy="580643"/>
                   <wp:effectExtent l="0" t="0" r="0" b="0"/>
                   <wp:docPr id="87" name="image44.jpeg"/>
@@ -6030,6 +6398,12 @@
                 <w:b/>
               </w:rPr>
             </w:pPr>
+            <w:r>
+              <w:rPr>
+                <w:b/>
+              </w:rPr>
+              <w:t>Conector ps2</w:t>
+            </w:r>
           </w:p>
         </w:tc>
         <w:tc>
@@ -6060,7 +6434,7 @@
                 <w:sz w:val="20"/>
               </w:rPr>
               <w:drawing>
-                <wp:inline distT="0" distB="0" distL="0" distR="0">
+                <wp:inline distT="0" distB="0" distL="0" distR="0" wp14:anchorId="53206A1D" wp14:editId="1D93CE9A">
                   <wp:extent cx="731520" cy="768096"/>
                   <wp:effectExtent l="0" t="0" r="0" b="0"/>
                   <wp:docPr id="89" name="image45.jpeg"/>
@@ -6105,6 +6479,13 @@
                 <w:sz w:val="23"/>
               </w:rPr>
             </w:pPr>
+            <w:r>
+              <w:rPr>
+                <w:b/>
+                <w:sz w:val="23"/>
+              </w:rPr>
+              <w:t>Ratón ps2</w:t>
+            </w:r>
           </w:p>
           <w:p>
             <w:pPr>
@@ -6140,22 +6521,6 @@
               <w:pStyle w:val="TableParagraph"/>
               <w:rPr>
                 <w:b/>
-              </w:rPr>
-            </w:pPr>
-          </w:p>
-          <w:p>
-            <w:pPr>
-              <w:pStyle w:val="TableParagraph"/>
-              <w:rPr>
-                <w:b/>
-              </w:rPr>
-            </w:pPr>
-          </w:p>
-          <w:p>
-            <w:pPr>
-              <w:pStyle w:val="TableParagraph"/>
-              <w:rPr>
-                <w:b/>
                 <w:sz w:val="17"/>
               </w:rPr>
             </w:pPr>
@@ -6169,6 +6534,12 @@
                 <w:b/>
               </w:rPr>
             </w:pPr>
+            <w:r>
+              <w:rPr>
+                <w:b/>
+              </w:rPr>
+              <w:t>Permite recibir la señal de entrada del ratón para poder seleccionar los objetos o campos que vamos a usar</w:t>
+            </w:r>
           </w:p>
         </w:tc>
       </w:tr>
@@ -6251,7 +6622,7 @@
                 <w:sz w:val="20"/>
               </w:rPr>
               <w:drawing>
-                <wp:inline distT="0" distB="0" distL="0" distR="0">
+                <wp:inline distT="0" distB="0" distL="0" distR="0" wp14:anchorId="4A69AB48" wp14:editId="52DCD1FB">
                   <wp:extent cx="548640" cy="548639"/>
                   <wp:effectExtent l="0" t="0" r="0" b="0"/>
                   <wp:docPr id="91" name="image46.jpeg"/>
@@ -6305,6 +6676,12 @@
                 <w:b/>
               </w:rPr>
             </w:pPr>
+            <w:r>
+              <w:rPr>
+                <w:b/>
+              </w:rPr>
+              <w:t>Conector ps2</w:t>
+            </w:r>
           </w:p>
         </w:tc>
         <w:tc>
@@ -6335,7 +6712,7 @@
                 <w:sz w:val="20"/>
               </w:rPr>
               <w:drawing>
-                <wp:inline distT="0" distB="0" distL="0" distR="0">
+                <wp:inline distT="0" distB="0" distL="0" distR="0" wp14:anchorId="7C706871" wp14:editId="7F63A438">
                   <wp:extent cx="1211535" cy="731519"/>
                   <wp:effectExtent l="0" t="0" r="0" b="0"/>
                   <wp:docPr id="93" name="image47.jpeg"/>
@@ -6381,6 +6758,12 @@
                 <w:b/>
               </w:rPr>
             </w:pPr>
+            <w:r>
+              <w:rPr>
+                <w:b/>
+              </w:rPr>
+              <w:t>Teclado ps2</w:t>
+            </w:r>
           </w:p>
         </w:tc>
         <w:tc>
@@ -6403,22 +6786,6 @@
           <w:p>
             <w:pPr>
               <w:pStyle w:val="TableParagraph"/>
-              <w:rPr>
-                <w:b/>
-              </w:rPr>
-            </w:pPr>
-          </w:p>
-          <w:p>
-            <w:pPr>
-              <w:pStyle w:val="TableParagraph"/>
-              <w:rPr>
-                <w:b/>
-              </w:rPr>
-            </w:pPr>
-          </w:p>
-          <w:p>
-            <w:pPr>
-              <w:pStyle w:val="TableParagraph"/>
               <w:spacing w:before="7"/>
               <w:rPr>
                 <w:b/>
@@ -6434,6 +6801,12 @@
                 <w:b/>
               </w:rPr>
             </w:pPr>
+            <w:r>
+              <w:rPr>
+                <w:b/>
+              </w:rPr>
+              <w:t>Permite recibir la señal de entrada de teclado para que podamos escribir o si el ratón no funciona, realizar tareas básicas en el equipo</w:t>
+            </w:r>
           </w:p>
         </w:tc>
       </w:tr>
@@ -6524,7 +6897,7 @@
                 <w:sz w:val="20"/>
               </w:rPr>
               <w:drawing>
-                <wp:inline distT="0" distB="0" distL="0" distR="0">
+                <wp:inline distT="0" distB="0" distL="0" distR="0" wp14:anchorId="2C9FEB36" wp14:editId="0E0F3BA1">
                   <wp:extent cx="1582915" cy="388619"/>
                   <wp:effectExtent l="0" t="0" r="0" b="0"/>
                   <wp:docPr id="95" name="image48.jpeg"/>
@@ -6579,6 +6952,12 @@
                 <w:b/>
               </w:rPr>
             </w:pPr>
+            <w:r>
+              <w:rPr>
+                <w:b/>
+              </w:rPr>
+              <w:t>Conector Impresora</w:t>
+            </w:r>
           </w:p>
         </w:tc>
         <w:tc>
@@ -6609,7 +6988,7 @@
                 <w:sz w:val="20"/>
               </w:rPr>
               <w:drawing>
-                <wp:inline distT="0" distB="0" distL="0" distR="0">
+                <wp:inline distT="0" distB="0" distL="0" distR="0" wp14:anchorId="796F4E20" wp14:editId="3E151C22">
                   <wp:extent cx="1253552" cy="713232"/>
                   <wp:effectExtent l="0" t="0" r="0" b="0"/>
                   <wp:docPr id="97" name="image49.jpeg"/>
@@ -6665,6 +7044,12 @@
                 <w:b/>
               </w:rPr>
             </w:pPr>
+            <w:r>
+              <w:rPr>
+                <w:b/>
+              </w:rPr>
+              <w:t>Impresora</w:t>
+            </w:r>
           </w:p>
         </w:tc>
         <w:tc>
@@ -6694,7 +7079,7 @@
                 <w:sz w:val="20"/>
               </w:rPr>
               <w:drawing>
-                <wp:inline distT="0" distB="0" distL="0" distR="0">
+                <wp:inline distT="0" distB="0" distL="0" distR="0" wp14:anchorId="4AE51D97" wp14:editId="52AD1082">
                   <wp:extent cx="1378664" cy="731519"/>
                   <wp:effectExtent l="0" t="0" r="0" b="0"/>
                   <wp:docPr id="99" name="image50.jpeg"/>
@@ -6749,6 +7134,12 @@
                 <w:b/>
               </w:rPr>
             </w:pPr>
+            <w:r>
+              <w:rPr>
+                <w:b/>
+              </w:rPr>
+              <w:t>Cable conector de impresora</w:t>
+            </w:r>
           </w:p>
         </w:tc>
         <w:tc>
@@ -6773,6 +7164,12 @@
                 <w:b/>
               </w:rPr>
             </w:pPr>
+            <w:r>
+              <w:rPr>
+                <w:b/>
+              </w:rPr>
+              <w:t>Permite la conexión de una impresora para poder imprimir documentos</w:t>
+            </w:r>
           </w:p>
         </w:tc>
       </w:tr>
@@ -6923,7 +7320,7 @@
                 <w:sz w:val="20"/>
               </w:rPr>
               <w:drawing>
-                <wp:inline distT="0" distB="0" distL="0" distR="0">
+                <wp:inline distT="0" distB="0" distL="0" distR="0" wp14:anchorId="545F1F38" wp14:editId="603D98EF">
                   <wp:extent cx="1360092" cy="699515"/>
                   <wp:effectExtent l="0" t="0" r="0" b="0"/>
                   <wp:docPr id="101" name="image51.jpeg"/>
@@ -6977,6 +7374,12 @@
                 <w:b/>
               </w:rPr>
             </w:pPr>
+            <w:r>
+              <w:rPr>
+                <w:b/>
+              </w:rPr>
+              <w:t>Conector Macho VGA</w:t>
+            </w:r>
           </w:p>
         </w:tc>
         <w:tc>
@@ -7006,7 +7409,7 @@
                 <w:sz w:val="20"/>
               </w:rPr>
               <w:drawing>
-                <wp:inline distT="0" distB="0" distL="0" distR="0">
+                <wp:inline distT="0" distB="0" distL="0" distR="0" wp14:anchorId="3620F0C0" wp14:editId="28C0CD1E">
                   <wp:extent cx="1008126" cy="900112"/>
                   <wp:effectExtent l="0" t="0" r="0" b="0"/>
                   <wp:docPr id="103" name="image39.jpeg"/>
@@ -7059,6 +7462,12 @@
                 <w:b/>
               </w:rPr>
             </w:pPr>
+            <w:r>
+              <w:rPr>
+                <w:b/>
+              </w:rPr>
+              <w:t>Monitor</w:t>
+            </w:r>
           </w:p>
         </w:tc>
         <w:tc>
@@ -7089,7 +7498,7 @@
                 <w:sz w:val="20"/>
               </w:rPr>
               <w:drawing>
-                <wp:inline distT="0" distB="0" distL="0" distR="0">
+                <wp:inline distT="0" distB="0" distL="0" distR="0" wp14:anchorId="0789C9CD" wp14:editId="4C0F5F0A">
                   <wp:extent cx="950976" cy="987551"/>
                   <wp:effectExtent l="0" t="0" r="0" b="0"/>
                   <wp:docPr id="105" name="image40.jpeg"/>
@@ -7143,6 +7552,14 @@
                 <w:b/>
               </w:rPr>
             </w:pPr>
+            <w:proofErr w:type="spellStart"/>
+            <w:r>
+              <w:rPr>
+                <w:b/>
+              </w:rPr>
+              <w:t>Vga</w:t>
+            </w:r>
+            <w:proofErr w:type="spellEnd"/>
           </w:p>
         </w:tc>
         <w:tc>
@@ -7167,6 +7584,12 @@
                 <w:b/>
               </w:rPr>
             </w:pPr>
+            <w:r>
+              <w:rPr>
+                <w:b/>
+              </w:rPr>
+              <w:t>Necesitamos conectar una parte del cable hembra al macho del ordenador y un adaptador para la otra parte del cable, ya que quedarían 2 partes hembras VGA y no se podría usar</w:t>
+            </w:r>
           </w:p>
         </w:tc>
       </w:tr>
@@ -7275,7 +7698,7 @@
                 <w:sz w:val="20"/>
               </w:rPr>
               <w:drawing>
-                <wp:inline distT="0" distB="0" distL="0" distR="0">
+                <wp:inline distT="0" distB="0" distL="0" distR="0" wp14:anchorId="04BDEADD" wp14:editId="04E7C6CD">
                   <wp:extent cx="1273591" cy="553212"/>
                   <wp:effectExtent l="0" t="0" r="0" b="0"/>
                   <wp:docPr id="107" name="image52.jpeg"/>
@@ -7329,6 +7752,12 @@
                 <w:b/>
               </w:rPr>
             </w:pPr>
+            <w:r>
+              <w:rPr>
+                <w:b/>
+              </w:rPr>
+              <w:t>Conector Hembra VGA</w:t>
+            </w:r>
           </w:p>
         </w:tc>
         <w:tc>
@@ -7359,7 +7788,7 @@
                 <w:sz w:val="20"/>
               </w:rPr>
               <w:drawing>
-                <wp:inline distT="0" distB="0" distL="0" distR="0">
+                <wp:inline distT="0" distB="0" distL="0" distR="0" wp14:anchorId="4AC267E2" wp14:editId="1F1838E6">
                   <wp:extent cx="1130813" cy="1135856"/>
                   <wp:effectExtent l="0" t="0" r="0" b="0"/>
                   <wp:docPr id="109" name="image53.jpeg"/>
@@ -7403,6 +7832,12 @@
                 <w:b/>
               </w:rPr>
             </w:pPr>
+            <w:r>
+              <w:rPr>
+                <w:b/>
+              </w:rPr>
+              <w:t>Monitor</w:t>
+            </w:r>
           </w:p>
         </w:tc>
         <w:tc>
@@ -7433,7 +7868,7 @@
                 <w:sz w:val="20"/>
               </w:rPr>
               <w:drawing>
-                <wp:inline distT="0" distB="0" distL="0" distR="0">
+                <wp:inline distT="0" distB="0" distL="0" distR="0" wp14:anchorId="7F4B8354" wp14:editId="0EFA1B10">
                   <wp:extent cx="1628770" cy="1093089"/>
                   <wp:effectExtent l="0" t="0" r="0" b="0"/>
                   <wp:docPr id="111" name="image54.jpeg"/>
@@ -7479,6 +7914,12 @@
                 <w:b/>
               </w:rPr>
             </w:pPr>
+            <w:r>
+              <w:rPr>
+                <w:b/>
+              </w:rPr>
+              <w:t>Cable VGA</w:t>
+            </w:r>
           </w:p>
         </w:tc>
         <w:tc>
@@ -7512,6 +7953,12 @@
                 <w:b/>
               </w:rPr>
             </w:pPr>
+            <w:r>
+              <w:rPr>
+                <w:b/>
+              </w:rPr>
+              <w:t>Para conectar este monitor no necesitaríamos ningún adaptador ni nada por el estilo, ya que se conectaría normalmente</w:t>
+            </w:r>
           </w:p>
         </w:tc>
       </w:tr>
@@ -7637,7 +8084,7 @@
                 <w:sz w:val="20"/>
               </w:rPr>
               <w:drawing>
-                <wp:inline distT="0" distB="0" distL="0" distR="0">
+                <wp:inline distT="0" distB="0" distL="0" distR="0" wp14:anchorId="2BECFDDE" wp14:editId="3DD40B4F">
                   <wp:extent cx="1315890" cy="588359"/>
                   <wp:effectExtent l="0" t="0" r="0" b="0"/>
                   <wp:docPr id="113" name="image55.jpeg"/>
@@ -7691,6 +8138,14 @@
                 <w:b/>
               </w:rPr>
             </w:pPr>
+            <w:proofErr w:type="spellStart"/>
+            <w:r>
+              <w:rPr>
+                <w:b/>
+              </w:rPr>
+              <w:t>GamePort</w:t>
+            </w:r>
+            <w:proofErr w:type="spellEnd"/>
           </w:p>
         </w:tc>
         <w:tc>
@@ -7721,7 +8176,7 @@
                 <w:sz w:val="20"/>
               </w:rPr>
               <w:drawing>
-                <wp:inline distT="0" distB="0" distL="0" distR="0">
+                <wp:inline distT="0" distB="0" distL="0" distR="0" wp14:anchorId="0AC2B17D" wp14:editId="6A1FCF71">
                   <wp:extent cx="1155724" cy="1188720"/>
                   <wp:effectExtent l="0" t="0" r="0" b="0"/>
                   <wp:docPr id="115" name="image56.jpeg"/>
@@ -7774,6 +8229,12 @@
                 <w:b/>
               </w:rPr>
             </w:pPr>
+            <w:r>
+              <w:rPr>
+                <w:b/>
+              </w:rPr>
+              <w:t>Joystick</w:t>
+            </w:r>
           </w:p>
         </w:tc>
         <w:tc>
@@ -7787,6 +8248,29 @@
                 <w:rFonts w:ascii="Times New Roman"/>
               </w:rPr>
             </w:pPr>
+          </w:p>
+          <w:p/>
+          <w:p/>
+          <w:p>
+            <w:pPr>
+              <w:rPr>
+                <w:rFonts w:ascii="Times New Roman"/>
+              </w:rPr>
+            </w:pPr>
+          </w:p>
+          <w:p>
+            <w:pPr>
+              <w:ind w:firstLine="720"/>
+            </w:pPr>
+            <w:r>
+              <w:t>conexión tradicional para los dispositivos de control de videojuegos</w:t>
+            </w:r>
+            <w:r>
+              <w:t xml:space="preserve"> </w:t>
+            </w:r>
+            <w:r>
+              <w:t>en las arquitecturas x86</w:t>
+            </w:r>
           </w:p>
         </w:tc>
         <w:tc>
@@ -7828,6 +8312,12 @@
                 <w:b/>
               </w:rPr>
             </w:pPr>
+            <w:r>
+              <w:rPr>
+                <w:b/>
+              </w:rPr>
+              <w:t>Para conectar joystick y jugar a juegos arcade</w:t>
+            </w:r>
           </w:p>
         </w:tc>
       </w:tr>
@@ -7986,7 +8476,7 @@
                 <w:sz w:val="20"/>
               </w:rPr>
               <w:drawing>
-                <wp:inline distT="0" distB="0" distL="0" distR="0">
+                <wp:inline distT="0" distB="0" distL="0" distR="0" wp14:anchorId="61660362" wp14:editId="219C9E92">
                   <wp:extent cx="736762" cy="906780"/>
                   <wp:effectExtent l="0" t="0" r="0" b="0"/>
                   <wp:docPr id="117" name="image57.jpeg"/>
@@ -8041,6 +8531,12 @@
                 <w:b/>
               </w:rPr>
             </w:pPr>
+            <w:r>
+              <w:rPr>
+                <w:b/>
+              </w:rPr>
+              <w:t>Conector Vídeo</w:t>
+            </w:r>
           </w:p>
         </w:tc>
         <w:tc>
@@ -8070,7 +8566,7 @@
                 <w:sz w:val="20"/>
               </w:rPr>
               <w:drawing>
-                <wp:inline distT="0" distB="0" distL="0" distR="0">
+                <wp:inline distT="0" distB="0" distL="0" distR="0" wp14:anchorId="107C03F6" wp14:editId="00B09B56">
                   <wp:extent cx="1423753" cy="1133856"/>
                   <wp:effectExtent l="0" t="0" r="0" b="0"/>
                   <wp:docPr id="119" name="image58.jpeg"/>
@@ -8125,6 +8621,12 @@
                 <w:b/>
               </w:rPr>
             </w:pPr>
+            <w:r>
+              <w:rPr>
+                <w:b/>
+              </w:rPr>
+              <w:t>Monitor</w:t>
+            </w:r>
           </w:p>
         </w:tc>
         <w:tc>
@@ -8164,7 +8666,7 @@
                 <w:sz w:val="20"/>
               </w:rPr>
               <w:drawing>
-                <wp:inline distT="0" distB="0" distL="0" distR="0">
+                <wp:inline distT="0" distB="0" distL="0" distR="0" wp14:anchorId="1243D0BE" wp14:editId="4EABB9BA">
                   <wp:extent cx="1383022" cy="924115"/>
                   <wp:effectExtent l="0" t="0" r="0" b="0"/>
                   <wp:docPr id="121" name="image59.jpeg"/>
@@ -8209,6 +8711,12 @@
                 <w:b/>
               </w:rPr>
             </w:pPr>
+            <w:r>
+              <w:rPr>
+                <w:b/>
+              </w:rPr>
+              <w:t>Cable vídeo</w:t>
+            </w:r>
           </w:p>
         </w:tc>
         <w:tc>
@@ -8242,6 +8750,12 @@
                 <w:b/>
               </w:rPr>
             </w:pPr>
+            <w:r>
+              <w:rPr>
+                <w:b/>
+              </w:rPr>
+              <w:t>Para tener salida de vídeo en televisores y monitores antiguos (Épocas de PS2)</w:t>
+            </w:r>
           </w:p>
         </w:tc>
       </w:tr>
@@ -8358,7 +8872,7 @@
                 <w:sz w:val="20"/>
               </w:rPr>
               <w:drawing>
-                <wp:inline distT="0" distB="0" distL="0" distR="0">
+                <wp:inline distT="0" distB="0" distL="0" distR="0" wp14:anchorId="2D00FC76" wp14:editId="19E1FB9C">
                   <wp:extent cx="1355498" cy="625792"/>
                   <wp:effectExtent l="0" t="0" r="0" b="0"/>
                   <wp:docPr id="123" name="image60.jpeg"/>
@@ -8412,6 +8926,12 @@
                 <w:b/>
               </w:rPr>
             </w:pPr>
+            <w:r>
+              <w:rPr>
+                <w:b/>
+              </w:rPr>
+              <w:t>Conector HDMI</w:t>
+            </w:r>
           </w:p>
         </w:tc>
         <w:tc>
@@ -8450,7 +8970,7 @@
                 <w:sz w:val="20"/>
               </w:rPr>
               <w:drawing>
-                <wp:inline distT="0" distB="0" distL="0" distR="0">
+                <wp:inline distT="0" distB="0" distL="0" distR="0" wp14:anchorId="0D7E40C1" wp14:editId="3F86DE9E">
                   <wp:extent cx="1096604" cy="877824"/>
                   <wp:effectExtent l="0" t="0" r="0" b="0"/>
                   <wp:docPr id="125" name="image61.jpeg"/>
@@ -8506,6 +9026,12 @@
                 <w:b/>
               </w:rPr>
             </w:pPr>
+            <w:r>
+              <w:rPr>
+                <w:b/>
+              </w:rPr>
+              <w:t>Monitor</w:t>
+            </w:r>
           </w:p>
         </w:tc>
         <w:tc>
@@ -8535,7 +9061,7 @@
                 <w:sz w:val="20"/>
               </w:rPr>
               <w:drawing>
-                <wp:inline distT="0" distB="0" distL="0" distR="0">
+                <wp:inline distT="0" distB="0" distL="0" distR="0" wp14:anchorId="34171736" wp14:editId="74E234DA">
                   <wp:extent cx="1284940" cy="1111186"/>
                   <wp:effectExtent l="0" t="0" r="0" b="0"/>
                   <wp:docPr id="127" name="image62.jpeg"/>
@@ -8589,6 +9115,12 @@
                 <w:b/>
               </w:rPr>
             </w:pPr>
+            <w:r>
+              <w:rPr>
+                <w:b/>
+              </w:rPr>
+              <w:t>Cable HDMI</w:t>
+            </w:r>
           </w:p>
         </w:tc>
         <w:tc>
@@ -8622,6 +9154,12 @@
                 <w:b/>
               </w:rPr>
             </w:pPr>
+            <w:r>
+              <w:rPr>
+                <w:b/>
+              </w:rPr>
+              <w:t>Para tener salida de vídeo en equipos recientes</w:t>
+            </w:r>
           </w:p>
         </w:tc>
       </w:tr>
@@ -8729,7 +9267,7 @@
                 <w:sz w:val="20"/>
               </w:rPr>
               <w:drawing>
-                <wp:inline distT="0" distB="0" distL="0" distR="0">
+                <wp:inline distT="0" distB="0" distL="0" distR="0" wp14:anchorId="25127EEA" wp14:editId="519BAA41">
                   <wp:extent cx="1132236" cy="512063"/>
                   <wp:effectExtent l="0" t="0" r="0" b="0"/>
                   <wp:docPr id="129" name="image63.jpeg"/>
@@ -8775,6 +9313,18 @@
                 <w:b/>
               </w:rPr>
             </w:pPr>
+            <w:r>
+              <w:rPr>
+                <w:b/>
+              </w:rPr>
+              <w:t xml:space="preserve">Conector </w:t>
+            </w:r>
+            <w:r>
+              <w:rPr>
+                <w:b/>
+              </w:rPr>
+              <w:t>FireWire</w:t>
+            </w:r>
           </w:p>
         </w:tc>
         <w:tc>
@@ -8805,7 +9355,7 @@
                 <w:sz w:val="20"/>
               </w:rPr>
               <w:drawing>
-                <wp:inline distT="0" distB="0" distL="0" distR="0">
+                <wp:inline distT="0" distB="0" distL="0" distR="0" wp14:anchorId="5BDF51E2" wp14:editId="215535E0">
                   <wp:extent cx="1000954" cy="836676"/>
                   <wp:effectExtent l="0" t="0" r="0" b="0"/>
                   <wp:docPr id="131" name="image64.png"/>
@@ -8851,6 +9401,12 @@
                 <w:b/>
               </w:rPr>
             </w:pPr>
+            <w:r>
+              <w:rPr>
+                <w:b/>
+              </w:rPr>
+              <w:t>Cámara de fotos</w:t>
+            </w:r>
           </w:p>
         </w:tc>
         <w:tc>
@@ -8889,7 +9445,7 @@
                 <w:sz w:val="20"/>
               </w:rPr>
               <w:drawing>
-                <wp:inline distT="0" distB="0" distL="0" distR="0">
+                <wp:inline distT="0" distB="0" distL="0" distR="0" wp14:anchorId="5D00A5FE" wp14:editId="7CECF662">
                   <wp:extent cx="1133474" cy="768095"/>
                   <wp:effectExtent l="0" t="0" r="0" b="0"/>
                   <wp:docPr id="133" name="image65.jpeg"/>
@@ -8933,6 +9489,18 @@
                 <w:b/>
               </w:rPr>
             </w:pPr>
+            <w:r>
+              <w:rPr>
+                <w:b/>
+              </w:rPr>
+              <w:t xml:space="preserve">Cable </w:t>
+            </w:r>
+            <w:r>
+              <w:rPr>
+                <w:b/>
+              </w:rPr>
+              <w:t>FireWire</w:t>
+            </w:r>
           </w:p>
           <w:p>
             <w:pPr>
@@ -8977,6 +9545,12 @@
                 <w:b/>
               </w:rPr>
             </w:pPr>
+            <w:r>
+              <w:rPr>
+                <w:b/>
+              </w:rPr>
+              <w:t>Para la transmisión de fotos entre equipos y cámaras digitales</w:t>
+            </w:r>
           </w:p>
         </w:tc>
       </w:tr>
@@ -9144,7 +9718,7 @@
                 <w:sz w:val="20"/>
               </w:rPr>
               <w:drawing>
-                <wp:inline distT="0" distB="0" distL="0" distR="0">
+                <wp:inline distT="0" distB="0" distL="0" distR="0" wp14:anchorId="29B50A22" wp14:editId="21528FFF">
                   <wp:extent cx="1248158" cy="809815"/>
                   <wp:effectExtent l="0" t="0" r="0" b="0"/>
                   <wp:docPr id="135" name="image66.jpeg"/>
@@ -9199,6 +9773,12 @@
                 <w:b/>
               </w:rPr>
             </w:pPr>
+            <w:r>
+              <w:rPr>
+                <w:b/>
+              </w:rPr>
+              <w:t>Conector rj45</w:t>
+            </w:r>
           </w:p>
         </w:tc>
         <w:tc>
@@ -9228,7 +9808,7 @@
                 <w:sz w:val="20"/>
               </w:rPr>
               <w:drawing>
-                <wp:inline distT="0" distB="0" distL="0" distR="0">
+                <wp:inline distT="0" distB="0" distL="0" distR="0" wp14:anchorId="776AF4B6" wp14:editId="5D3AEA78">
                   <wp:extent cx="1451156" cy="1105185"/>
                   <wp:effectExtent l="0" t="0" r="0" b="0"/>
                   <wp:docPr id="137" name="image67.png"/>
@@ -9284,6 +9864,20 @@
                 <w:b/>
               </w:rPr>
             </w:pPr>
+            <w:proofErr w:type="spellStart"/>
+            <w:r>
+              <w:rPr>
+                <w:b/>
+              </w:rPr>
+              <w:t>Router</w:t>
+            </w:r>
+            <w:proofErr w:type="spellEnd"/>
+            <w:r>
+              <w:rPr>
+                <w:b/>
+              </w:rPr>
+              <w:t>/repetidor</w:t>
+            </w:r>
           </w:p>
         </w:tc>
         <w:tc>
@@ -9323,7 +9917,7 @@
                 <w:sz w:val="20"/>
               </w:rPr>
               <w:drawing>
-                <wp:inline distT="0" distB="0" distL="0" distR="0">
+                <wp:inline distT="0" distB="0" distL="0" distR="0" wp14:anchorId="3841DD47" wp14:editId="51D2C4E8">
                   <wp:extent cx="1392862" cy="950976"/>
                   <wp:effectExtent l="0" t="0" r="0" b="0"/>
                   <wp:docPr id="139" name="image68.jpeg"/>
@@ -9376,6 +9970,12 @@
                 <w:b/>
               </w:rPr>
             </w:pPr>
+            <w:r>
+              <w:rPr>
+                <w:b/>
+              </w:rPr>
+              <w:t>Cable rj45</w:t>
+            </w:r>
           </w:p>
         </w:tc>
         <w:tc>
@@ -9391,6 +9991,26 @@
                 <w:b/>
               </w:rPr>
             </w:pPr>
+            <w:r>
+              <w:rPr>
+                <w:b/>
+              </w:rPr>
+              <w:t xml:space="preserve">Para la conexión alámbrica entre equipos o a un </w:t>
+            </w:r>
+            <w:proofErr w:type="spellStart"/>
+            <w:r>
+              <w:rPr>
+                <w:b/>
+              </w:rPr>
+              <w:t>router</w:t>
+            </w:r>
+            <w:proofErr w:type="spellEnd"/>
+            <w:r>
+              <w:rPr>
+                <w:b/>
+              </w:rPr>
+              <w:t xml:space="preserve"> para red interna o para tener acceso a internet</w:t>
+            </w:r>
           </w:p>
         </w:tc>
       </w:tr>
@@ -9489,7 +10109,7 @@
                 <w:sz w:val="20"/>
               </w:rPr>
               <w:drawing>
-                <wp:inline distT="0" distB="0" distL="0" distR="0">
+                <wp:inline distT="0" distB="0" distL="0" distR="0" wp14:anchorId="1DD8E980" wp14:editId="25829896">
                   <wp:extent cx="1326175" cy="875442"/>
                   <wp:effectExtent l="0" t="0" r="0" b="0"/>
                   <wp:docPr id="141" name="image69.jpeg"/>
@@ -9543,6 +10163,12 @@
                 <w:b/>
               </w:rPr>
             </w:pPr>
+            <w:r>
+              <w:rPr>
+                <w:b/>
+              </w:rPr>
+              <w:t>Conector USB 1.0</w:t>
+            </w:r>
           </w:p>
         </w:tc>
         <w:tc>
@@ -9591,7 +10217,7 @@
                 <w:sz w:val="20"/>
               </w:rPr>
               <w:drawing>
-                <wp:inline distT="0" distB="0" distL="0" distR="0">
+                <wp:inline distT="0" distB="0" distL="0" distR="0" wp14:anchorId="1E24781A" wp14:editId="78204D77">
                   <wp:extent cx="1034067" cy="370332"/>
                   <wp:effectExtent l="0" t="0" r="0" b="0"/>
                   <wp:docPr id="143" name="image70.jpeg"/>
@@ -9645,6 +10271,12 @@
                 <w:b/>
               </w:rPr>
             </w:pPr>
+            <w:r>
+              <w:rPr>
+                <w:b/>
+              </w:rPr>
+              <w:t>USB</w:t>
+            </w:r>
           </w:p>
         </w:tc>
         <w:tc>
@@ -9698,6 +10330,46 @@
                 <w:b/>
               </w:rPr>
             </w:pPr>
+            <w:r>
+              <w:rPr>
+                <w:b/>
+              </w:rPr>
+              <w:t xml:space="preserve">Para el uso de dispositivos </w:t>
+            </w:r>
+            <w:proofErr w:type="spellStart"/>
+            <w:r>
+              <w:rPr>
+                <w:b/>
+              </w:rPr>
+              <w:t>play</w:t>
+            </w:r>
+            <w:proofErr w:type="spellEnd"/>
+            <w:r>
+              <w:rPr>
+                <w:b/>
+              </w:rPr>
+              <w:t xml:space="preserve"> and </w:t>
+            </w:r>
+            <w:proofErr w:type="spellStart"/>
+            <w:r>
+              <w:rPr>
+                <w:b/>
+              </w:rPr>
+              <w:t>plug</w:t>
+            </w:r>
+            <w:proofErr w:type="spellEnd"/>
+            <w:r>
+              <w:rPr>
+                <w:b/>
+              </w:rPr>
+              <w:t xml:space="preserve"> (</w:t>
+            </w:r>
+            <w:r>
+              <w:rPr>
+                <w:b/>
+              </w:rPr>
+              <w:t>USB, teclado, ratón, …) permite la conexión y desconexión en cualquier punto del equipo (encendido o apagado)</w:t>
+            </w:r>
           </w:p>
         </w:tc>
       </w:tr>
@@ -9797,7 +10469,7 @@
                 <w:sz w:val="20"/>
               </w:rPr>
               <w:drawing>
-                <wp:inline distT="0" distB="0" distL="0" distR="0">
+                <wp:inline distT="0" distB="0" distL="0" distR="0" wp14:anchorId="0A48CE23" wp14:editId="2618CA97">
                   <wp:extent cx="762000" cy="1162050"/>
                   <wp:effectExtent l="0" t="0" r="0" b="0"/>
                   <wp:docPr id="145" name="image71.jpeg"/>
@@ -9850,6 +10522,12 @@
                 <w:b/>
               </w:rPr>
             </w:pPr>
+            <w:r>
+              <w:rPr>
+                <w:b/>
+              </w:rPr>
+              <w:t>TRS</w:t>
+            </w:r>
           </w:p>
         </w:tc>
         <w:tc>
@@ -9879,7 +10557,7 @@
                 <w:sz w:val="20"/>
               </w:rPr>
               <w:drawing>
-                <wp:inline distT="0" distB="0" distL="0" distR="0">
+                <wp:inline distT="0" distB="0" distL="0" distR="0" wp14:anchorId="2020CD56" wp14:editId="257224DA">
                   <wp:extent cx="1299209" cy="1299210"/>
                   <wp:effectExtent l="0" t="0" r="0" b="0"/>
                   <wp:docPr id="147" name="image72.jpeg"/>
@@ -9925,6 +10603,12 @@
                 <w:b/>
               </w:rPr>
             </w:pPr>
+            <w:r>
+              <w:rPr>
+                <w:b/>
+              </w:rPr>
+              <w:t>altavoces</w:t>
+            </w:r>
           </w:p>
         </w:tc>
         <w:tc>
@@ -9955,7 +10639,7 @@
                 <w:sz w:val="20"/>
               </w:rPr>
               <w:drawing>
-                <wp:inline distT="0" distB="0" distL="0" distR="0">
+                <wp:inline distT="0" distB="0" distL="0" distR="0" wp14:anchorId="26FC730C" wp14:editId="3DD66183">
                   <wp:extent cx="922401" cy="881253"/>
                   <wp:effectExtent l="0" t="0" r="0" b="0"/>
                   <wp:docPr id="149" name="image73.jpeg"/>
@@ -10009,6 +10693,12 @@
                 <w:b/>
               </w:rPr>
             </w:pPr>
+            <w:r>
+              <w:rPr>
+                <w:b/>
+              </w:rPr>
+              <w:t>Cable entrada y salida audio</w:t>
+            </w:r>
           </w:p>
         </w:tc>
         <w:tc>
@@ -10043,6 +10733,18 @@
                 <w:b/>
               </w:rPr>
             </w:pPr>
+            <w:r>
+              <w:rPr>
+                <w:b/>
+              </w:rPr>
+              <w:t>El verde permite audio e</w:t>
+            </w:r>
+            <w:r>
+              <w:rPr>
+                <w:b/>
+              </w:rPr>
+              <w:t>stéreo para salida y el rojo permite la entrada de audio estéreo o mono</w:t>
+            </w:r>
           </w:p>
         </w:tc>
       </w:tr>
@@ -10190,7 +10892,7 @@
                 <w:sz w:val="20"/>
               </w:rPr>
               <w:drawing>
-                <wp:inline distT="0" distB="0" distL="0" distR="0">
+                <wp:inline distT="0" distB="0" distL="0" distR="0" wp14:anchorId="6467A35F" wp14:editId="76F369F8">
                   <wp:extent cx="1150430" cy="1395602"/>
                   <wp:effectExtent l="0" t="0" r="0" b="0"/>
                   <wp:docPr id="151" name="image74.jpeg"/>
@@ -10244,6 +10946,12 @@
                 <w:b/>
               </w:rPr>
             </w:pPr>
+            <w:r>
+              <w:rPr>
+                <w:b/>
+              </w:rPr>
+              <w:t>Conector óptico</w:t>
+            </w:r>
           </w:p>
         </w:tc>
         <w:tc>
@@ -10283,7 +10991,7 @@
                 <w:sz w:val="20"/>
               </w:rPr>
               <w:drawing>
-                <wp:inline distT="0" distB="0" distL="0" distR="0">
+                <wp:inline distT="0" distB="0" distL="0" distR="0" wp14:anchorId="733555F6" wp14:editId="602FBCC5">
                   <wp:extent cx="1096643" cy="877824"/>
                   <wp:effectExtent l="0" t="0" r="0" b="0"/>
                   <wp:docPr id="153" name="image61.jpeg"/>
@@ -10346,6 +11054,12 @@
                 <w:b/>
               </w:rPr>
             </w:pPr>
+            <w:r>
+              <w:rPr>
+                <w:b/>
+              </w:rPr>
+              <w:t>Monitor</w:t>
+            </w:r>
           </w:p>
         </w:tc>
         <w:tc>
@@ -10384,7 +11098,7 @@
                 <w:sz w:val="20"/>
               </w:rPr>
               <w:drawing>
-                <wp:inline distT="0" distB="0" distL="0" distR="0">
+                <wp:inline distT="0" distB="0" distL="0" distR="0" wp14:anchorId="2269BBE4" wp14:editId="4D59EA00">
                   <wp:extent cx="1357884" cy="1161288"/>
                   <wp:effectExtent l="0" t="0" r="0" b="0"/>
                   <wp:docPr id="155" name="image75.jpeg"/>
@@ -10438,6 +11152,12 @@
                 <w:b/>
               </w:rPr>
             </w:pPr>
+            <w:r>
+              <w:rPr>
+                <w:b/>
+              </w:rPr>
+              <w:t>Cable óptico</w:t>
+            </w:r>
           </w:p>
         </w:tc>
         <w:tc>
@@ -10470,6 +11190,12 @@
                 <w:b/>
               </w:rPr>
             </w:pPr>
+            <w:r>
+              <w:rPr>
+                <w:b/>
+              </w:rPr>
+              <w:t xml:space="preserve">Permite la salida de vídeo de manera óptica como los cables de fibra  </w:t>
+            </w:r>
           </w:p>
         </w:tc>
       </w:tr>
@@ -10570,7 +11296,7 @@
                 <w:sz w:val="20"/>
               </w:rPr>
               <w:drawing>
-                <wp:inline distT="0" distB="0" distL="0" distR="0">
+                <wp:inline distT="0" distB="0" distL="0" distR="0" wp14:anchorId="0D72E97B" wp14:editId="0C73C13E">
                   <wp:extent cx="1316480" cy="903541"/>
                   <wp:effectExtent l="0" t="0" r="0" b="0"/>
                   <wp:docPr id="157" name="image76.jpeg"/>
@@ -10615,6 +11341,13 @@
                 <w:sz w:val="23"/>
               </w:rPr>
             </w:pPr>
+            <w:r>
+              <w:rPr>
+                <w:b/>
+                <w:sz w:val="23"/>
+              </w:rPr>
+              <w:t>Conector DVI</w:t>
+            </w:r>
           </w:p>
           <w:p>
             <w:pPr>
@@ -10655,7 +11388,7 @@
                 <w:sz w:val="20"/>
               </w:rPr>
               <w:drawing>
-                <wp:inline distT="0" distB="0" distL="0" distR="0">
+                <wp:inline distT="0" distB="0" distL="0" distR="0" wp14:anchorId="4FC92BC8" wp14:editId="73A183B3">
                   <wp:extent cx="1038315" cy="1003649"/>
                   <wp:effectExtent l="0" t="0" r="0" b="0"/>
                   <wp:docPr id="159" name="image77.jpeg"/>
@@ -10710,6 +11443,12 @@
                 <w:b/>
               </w:rPr>
             </w:pPr>
+            <w:r>
+              <w:rPr>
+                <w:b/>
+              </w:rPr>
+              <w:t>monitor</w:t>
+            </w:r>
           </w:p>
         </w:tc>
         <w:tc>
@@ -10749,7 +11488,7 @@
                 <w:sz w:val="20"/>
               </w:rPr>
               <w:drawing>
-                <wp:inline distT="0" distB="0" distL="0" distR="0">
+                <wp:inline distT="0" distB="0" distL="0" distR="0" wp14:anchorId="16466763" wp14:editId="25F8F019">
                   <wp:extent cx="1654217" cy="1152144"/>
                   <wp:effectExtent l="0" t="0" r="0" b="0"/>
                   <wp:docPr id="161" name="image78.jpeg"/>
@@ -10795,6 +11534,12 @@
                 <w:b/>
               </w:rPr>
             </w:pPr>
+            <w:r>
+              <w:rPr>
+                <w:b/>
+              </w:rPr>
+              <w:t>Cable DVI</w:t>
+            </w:r>
           </w:p>
         </w:tc>
         <w:tc>
@@ -10820,6 +11565,12 @@
                 <w:b/>
               </w:rPr>
             </w:pPr>
+            <w:r>
+              <w:rPr>
+                <w:b/>
+              </w:rPr>
+              <w:t>Permite la salida de vídeo a través del conector DVI</w:t>
+            </w:r>
           </w:p>
         </w:tc>
       </w:tr>
@@ -10910,7 +11661,7 @@
                 <w:sz w:val="20"/>
               </w:rPr>
               <w:drawing>
-                <wp:inline distT="0" distB="0" distL="0" distR="0">
+                <wp:inline distT="0" distB="0" distL="0" distR="0" wp14:anchorId="5A1FAC39" wp14:editId="0C1EE8F1">
                   <wp:extent cx="1509942" cy="892683"/>
                   <wp:effectExtent l="0" t="0" r="0" b="0"/>
                   <wp:docPr id="163" name="image79.jpeg"/>
@@ -10964,6 +11715,12 @@
                 <w:b/>
               </w:rPr>
             </w:pPr>
+            <w:r>
+              <w:rPr>
+                <w:b/>
+              </w:rPr>
+              <w:t>Conector ESATA</w:t>
+            </w:r>
           </w:p>
         </w:tc>
         <w:tc>
@@ -11003,7 +11760,7 @@
                 <w:sz w:val="20"/>
               </w:rPr>
               <w:drawing>
-                <wp:inline distT="0" distB="0" distL="0" distR="0">
+                <wp:inline distT="0" distB="0" distL="0" distR="0" wp14:anchorId="18DB1E0D" wp14:editId="291C8A8D">
                   <wp:extent cx="1101108" cy="882396"/>
                   <wp:effectExtent l="0" t="0" r="0" b="0"/>
                   <wp:docPr id="165" name="image80.jpeg"/>
@@ -11057,6 +11814,12 @@
                 <w:b/>
               </w:rPr>
             </w:pPr>
+            <w:r>
+              <w:rPr>
+                <w:b/>
+              </w:rPr>
+              <w:t>Disco duro</w:t>
+            </w:r>
           </w:p>
         </w:tc>
         <w:tc>
@@ -11087,7 +11850,7 @@
                 <w:sz w:val="20"/>
               </w:rPr>
               <w:drawing>
-                <wp:inline distT="0" distB="0" distL="0" distR="0">
+                <wp:inline distT="0" distB="0" distL="0" distR="0" wp14:anchorId="46FC150B" wp14:editId="4FC02E52">
                   <wp:extent cx="1545756" cy="845819"/>
                   <wp:effectExtent l="0" t="0" r="0" b="0"/>
                   <wp:docPr id="167" name="image27.jpeg"/>
@@ -11142,6 +11905,12 @@
                 <w:b/>
               </w:rPr>
             </w:pPr>
+            <w:r>
+              <w:rPr>
+                <w:b/>
+              </w:rPr>
+              <w:t>Cable SATA</w:t>
+            </w:r>
           </w:p>
         </w:tc>
         <w:tc>
@@ -11173,6 +11942,13 @@
                 <w:sz w:val="24"/>
               </w:rPr>
             </w:pPr>
+            <w:r>
+              <w:rPr>
+                <w:b/>
+                <w:sz w:val="24"/>
+              </w:rPr>
+              <w:t>Permite el uso de discos SATA de manera externa a la placa donde usualmente es donde se encuentran los discos</w:t>
+            </w:r>
           </w:p>
           <w:p>
             <w:pPr>
@@ -11336,7 +12112,7 @@
                 <w:sz w:val="20"/>
               </w:rPr>
               <w:drawing>
-                <wp:inline distT="0" distB="0" distL="0" distR="0">
+                <wp:inline distT="0" distB="0" distL="0" distR="0" wp14:anchorId="1ABDEC23" wp14:editId="0318C738">
                   <wp:extent cx="600840" cy="1339214"/>
                   <wp:effectExtent l="0" t="0" r="0" b="0"/>
                   <wp:docPr id="169" name="image81.jpeg"/>
@@ -11391,6 +12167,34 @@
                 <w:b/>
               </w:rPr>
             </w:pPr>
+            <w:proofErr w:type="spellStart"/>
+            <w:r>
+              <w:rPr>
+                <w:b/>
+              </w:rPr>
+              <w:t>Stereo</w:t>
+            </w:r>
+            <w:proofErr w:type="spellEnd"/>
+            <w:r>
+              <w:rPr>
+                <w:b/>
+              </w:rPr>
+              <w:t xml:space="preserve"> </w:t>
+            </w:r>
+            <w:proofErr w:type="spellStart"/>
+            <w:r>
+              <w:rPr>
+                <w:b/>
+              </w:rPr>
+              <w:t>Analog</w:t>
+            </w:r>
+            <w:proofErr w:type="spellEnd"/>
+            <w:r>
+              <w:rPr>
+                <w:b/>
+              </w:rPr>
+              <w:t xml:space="preserve"> Audio</w:t>
+            </w:r>
           </w:p>
         </w:tc>
         <w:tc>
@@ -11430,7 +12234,7 @@
                 <w:sz w:val="20"/>
               </w:rPr>
               <w:drawing>
-                <wp:inline distT="0" distB="0" distL="0" distR="0">
+                <wp:inline distT="0" distB="0" distL="0" distR="0" wp14:anchorId="689F7447" wp14:editId="483CA5D5">
                   <wp:extent cx="1050041" cy="1332738"/>
                   <wp:effectExtent l="0" t="0" r="0" b="0"/>
                   <wp:docPr id="171" name="image82.jpeg"/>
@@ -11486,6 +12290,12 @@
                 <w:b/>
               </w:rPr>
             </w:pPr>
+            <w:r>
+              <w:rPr>
+                <w:b/>
+              </w:rPr>
+              <w:t>Altavoces</w:t>
+            </w:r>
           </w:p>
         </w:tc>
         <w:tc>
@@ -11525,7 +12335,7 @@
                 <w:sz w:val="20"/>
               </w:rPr>
               <w:drawing>
-                <wp:inline distT="0" distB="0" distL="0" distR="0">
+                <wp:inline distT="0" distB="0" distL="0" distR="0" wp14:anchorId="59B2A548" wp14:editId="357BB13F">
                   <wp:extent cx="1714536" cy="1280160"/>
                   <wp:effectExtent l="0" t="0" r="0" b="0"/>
                   <wp:docPr id="173" name="image83.jpeg"/>
@@ -11581,6 +12391,12 @@
                 <w:b/>
               </w:rPr>
             </w:pPr>
+            <w:r>
+              <w:rPr>
+                <w:b/>
+              </w:rPr>
+              <w:t>Cable de audio</w:t>
+            </w:r>
           </w:p>
         </w:tc>
         <w:tc>
@@ -11630,6 +12446,26 @@
                 <w:b/>
               </w:rPr>
             </w:pPr>
+            <w:r>
+              <w:rPr>
+                <w:b/>
+              </w:rPr>
+              <w:t xml:space="preserve">Permiten la salida de sonido de manera </w:t>
+            </w:r>
+            <w:proofErr w:type="spellStart"/>
+            <w:r>
+              <w:rPr>
+                <w:b/>
+              </w:rPr>
+              <w:t>esterea</w:t>
+            </w:r>
+            <w:proofErr w:type="spellEnd"/>
+            <w:r>
+              <w:rPr>
+                <w:b/>
+              </w:rPr>
+              <w:t>, cada altavoz requiere de 2 pines para cada lado</w:t>
+            </w:r>
           </w:p>
         </w:tc>
       </w:tr>
@@ -11674,7 +12510,7 @@
       </w:rPr>
     </w:pPr>
     <w:r>
-      <w:pict>
+      <w:pict w14:anchorId="664809A7">
         <v:shapetype id="_x0000_t202" coordsize="21600,21600" o:spt="202" path="m,l,21600r21600,l21600,xe">
           <v:stroke joinstyle="miter"/>
           <v:path gradientshapeok="t" o:connecttype="rect"/>
@@ -11744,7 +12580,7 @@
       </w:rPr>
     </w:pPr>
     <w:r>
-      <w:pict>
+      <w:pict w14:anchorId="0BFCCDF8">
         <v:shapetype id="_x0000_t202" coordsize="21600,21600" o:spt="202" path="m,l,21600r21600,l21600,xe">
           <v:stroke joinstyle="miter"/>
           <v:path gradientshapeok="t" o:connecttype="rect"/>
@@ -11778,7 +12614,7 @@
       </w:pict>
     </w:r>
     <w:r>
-      <w:pict>
+      <w:pict w14:anchorId="7C766D32">
         <v:shape id="_x0000_s2051" type="#_x0000_t202" style="position:absolute;margin-left:596.9pt;margin-top:36.55pt;width:189.1pt;height:13pt;z-index:-16388096;mso-position-horizontal-relative:page;mso-position-vertical-relative:page" filled="f" stroked="f">
           <v:textbox style="mso-next-textbox:#_x0000_s2051" inset="0,0,0,0">
             <w:txbxContent>

</xml_diff>